<commit_message>
Resume: normalize dashes, dedupe skills, fix summary voice
Co-Authored-By: Claude Opus 4.8 (1M context) <noreply@anthropic.com>
</commit_message>
<xml_diff>
--- a/resume/resume.docx
+++ b/resume/resume.docx
@@ -19,7 +19,7 @@
         <w:rPr>
           <w:color w:val="595959"/>
         </w:rPr>
-        <w:t>Senior Data and AI Solutions Engineer</w:t>
+        <w:t>Senior AI and Data Solutions Engineer</w:t>
       </w:r>
     </w:p>
     <w:p>
@@ -101,7 +101,7 @@
         <w:pStyle w:val="FirstParagraph"/>
       </w:pPr>
       <w:r>
-        <w:t xml:space="preserve">Senior Software Engineer with 18+ years of experience across, AI systems, data engineering, and cloud-native software. I design and deploy production-ready AI pipelines, data platforms, and decision-support tools - translating complex technical requirements into scalable, secure, and measurable outcomes. Experience spans global health research, enterprise software at Microsoft, and AI consulting for healthcare and finance.</w:t>
+        <w:t xml:space="preserve">Senior Software Engineer with 18+ years of experience across AI systems, data engineering, and cloud-native software. Designs and deploys production-ready AI pipelines, data platforms, and decision-support tools - translating complex technical requirements into scalable, secure, and measurable outcomes. Experience spans global health research, enterprise software at Microsoft, and AI consulting for healthcare and finance.</w:t>
       </w:r>
     </w:p>
     <w:bookmarkEnd w:id="20"/>
@@ -129,7 +129,7 @@
         <w:t xml:space="preserve"> </w:t>
       </w:r>
       <w:r>
-        <w:t xml:space="preserve">LLMs, AI agents, multi-agent systems, RAG, NLP (natural language processing), intelligent automation, MLOps; OpenAI SDK, Anthropic Claude SDK, Azure OpenAI, Azure AI Foundry; LangChain, LangGraph; knowledge graphs, semantic concept extraction; local LLMs for prototyping; Databricks; prompt, context, and token optimization (FinOps for AI); model selection, evaluation, and A/B testing; automated LLM-based quality scoring pipelines; AI guardrails and Responsible AI practices; document ingestion pipelines (multi-format: PDF, image, DOCX, text, OCR), recursive chunking, sentence-transformers embeddings, hybrid search (vector + BM25/RRF), sqlite-vec and pgvector; multi-agent supervisor orchestration patterns (LangGraph-equivalent: supervisor node, conditional routing, async interrupt/resume).</w:t>
+        <w:t xml:space="preserve">LLMs, AI agents, multi-agent systems, RAG, NLP (natural language processing), MLOps, intelligent automation; OpenAI SDK, Anthropic Claude SDK, Azure OpenAI, Azure AI Foundry, LangChain, LangGraph, Databricks; knowledge graphs, semantic concept extraction, sentence-transformers embeddings; document ingestion pipelines (PDF, image, DOCX, text, OCR), recursive chunking, hybrid search (vector + BM25/RRF), supervisor orchestration patterns; prompt, context, and token optimization (FinOps for AI), model selection, evaluation, and A/B testing, automated LLM-based quality-scoring pipelines; AI guardrails and Responsible AI practices, local LLMs for prototyping.</w:t>
       </w:r>
     </w:p>
     <w:p>
@@ -147,7 +147,7 @@
         <w:t xml:space="preserve"> </w:t>
       </w:r>
       <w:r>
-        <w:t xml:space="preserve">Azure Data Factory, Synapse Analytics, Analysis Services, Data Lake Storage, Event Hub, Cosmos DB, Microsoft Fabric; SQL, NoSQL, SQLite, ETL/ELT, data modeling, Data Lake, Redis, Blob, Azure Container Apps.</w:t>
+        <w:t xml:space="preserve">Azure Data Factory, Synapse Analytics, Analysis Services, Data Lake Storage, Event Hub, Cosmos DB, Microsoft Fabric; SQL, NoSQL, SQLite, ETL/ELT, data modeling, Redis, Blob Storage; vector databases (pgvector, sqlite-vec); Azure Container Apps.</w:t>
       </w:r>
     </w:p>
     <w:p>
@@ -183,7 +183,7 @@
         <w:t xml:space="preserve"> </w:t>
       </w:r>
       <w:r>
-        <w:t xml:space="preserve">Docker, Kubernetes; Azure DevOps, GitHub Actions, Drone; ARM, Terraform, Bicep (IaC); FastAPI, RESTful APIs; vector database (pgvector, sqlite-vec); async/parallel pipeline architecture; caching strategies for AI services; GitHub Copilot.</w:t>
+        <w:t xml:space="preserve">Docker, Kubernetes; Azure DevOps, GitHub Actions, Drone; ARM, Terraform, Bicep (IaC); FastAPI, RESTful APIs; async/parallel pipeline architecture; caching strategies for AI services; GitHub Copilot.</w:t>
       </w:r>
     </w:p>
     <w:p>
@@ -322,7 +322,7 @@
         <w:pStyle w:val="BodyText"/>
       </w:pPr>
       <w:r>
-        <w:t xml:space="preserve">Built a production RAG pipeline for legal document analysis: Google and MS Graph API source connectors, multi-format extraction (PDF, DOCX, EML, JPG, XLSX, OCR), classification-first metadata enrichment, recursive chunking tuned for legal prose, sentence-transformers embeddings (768 dims), and semantic search with sqlite-vec. Benchmarked chunk-level vs single-doc retrieval: chunk strategy scores 13% higher precision (0.538 vs 0.475 avg similarity) with only 42% result overlap, confirming chunks surface passage-level relevance that document-level embeddings miss. 314 documents, 4,391 chunks, sub-200ms queries. Optimized for maximum read-dache tokens.</w:t>
+        <w:t xml:space="preserve">Built a production RAG pipeline for legal document analysis: Google and MS Graph API source connectors, multi-format extraction (PDF, DOCX, EML, JPG, XLSX, OCR), classification-first metadata enrichment, recursive chunking tuned for legal prose, sentence-transformers embeddings (768 dims), and semantic search with sqlite-vec. Benchmarked chunk-level vs single-doc retrieval: chunk strategy scores 13% higher precision (0.538 vs 0.475 avg similarity) with only 42% result overlap, confirming chunks surface passage-level relevance that document-level embeddings miss. 314 documents, 4,391 chunks, sub-200ms queries. Optimized for maximum read-cache tokens.</w:t>
       </w:r>
     </w:p>
     <w:p>
@@ -620,7 +620,7 @@
           <w:i/>
           <w:iCs/>
         </w:rPr>
-        <w:t xml:space="preserve">2017 – 2019</w:t>
+        <w:t xml:space="preserve">2017 - 2019</w:t>
       </w:r>
       <w:r>
         <w:br/>
@@ -664,7 +664,7 @@
           <w:i/>
           <w:iCs/>
         </w:rPr>
-        <w:t xml:space="preserve">2012 – 2017</w:t>
+        <w:t xml:space="preserve">2012 - 2017</w:t>
       </w:r>
       <w:r>
         <w:br/>

</xml_diff>